<commit_message>
fix(report): tighten spacing and line height for red annotation paragraphs
</commit_message>
<xml_diff>
--- a/docs/大数据可视化/《大数据可视化》课程设计报告.docx
+++ b/docs/大数据可视化/《大数据可视化》课程设计报告.docx
@@ -2943,6 +2943,9 @@
       </w:r>
     </w:p>
     <w:p>
+      <w:pPr>
+        <w:spacing w:before="40" w:after="20" w:line="240" w:lineRule="auto"/>
+      </w:pPr>
       <w:r>
         <w:rPr>
           <w:b/>
@@ -3091,7 +3094,7 @@
     </w:p>
     <w:p>
       <w:pPr>
-        <w:spacing w:before="80" w:after="40"/>
+        <w:spacing w:before="40" w:after="20" w:line="240" w:lineRule="auto"/>
       </w:pPr>
       <w:r>
         <w:rPr>
@@ -5160,6 +5163,9 @@
       </w:r>
     </w:p>
     <w:p>
+      <w:pPr>
+        <w:spacing w:before="40" w:after="20" w:line="240" w:lineRule="auto"/>
+      </w:pPr>
       <w:r>
         <w:rPr>
           <w:b/>
@@ -5200,7 +5206,7 @@
     </w:p>
     <w:p>
       <w:pPr>
-        <w:spacing w:before="80" w:after="40"/>
+        <w:spacing w:before="40" w:after="20" w:line="240" w:lineRule="auto"/>
       </w:pPr>
       <w:proofErr w:type="spellStart"/>
       <w:r>
@@ -6482,6 +6488,9 @@
       </w:r>
     </w:p>
     <w:p>
+      <w:pPr>
+        <w:spacing w:before="40" w:after="20" w:line="240" w:lineRule="auto"/>
+      </w:pPr>
       <w:r>
         <w:rPr>
           <w:b/>
@@ -6522,7 +6531,7 @@
     </w:p>
     <w:p>
       <w:pPr>
-        <w:spacing w:before="80" w:after="40"/>
+        <w:spacing w:before="40" w:after="20" w:line="240" w:lineRule="auto"/>
       </w:pPr>
       <w:proofErr w:type="spellStart"/>
       <w:r>
@@ -6938,6 +6947,9 @@
       </w:r>
     </w:p>
     <w:p>
+      <w:pPr>
+        <w:spacing w:before="40" w:after="20" w:line="240" w:lineRule="auto"/>
+      </w:pPr>
       <w:r>
         <w:rPr>
           <w:b/>
@@ -6978,7 +6990,7 @@
     </w:p>
     <w:p>
       <w:pPr>
-        <w:spacing w:before="80" w:after="40"/>
+        <w:spacing w:before="40" w:after="20" w:line="240" w:lineRule="auto"/>
       </w:pPr>
       <w:r>
         <w:rPr>
@@ -8067,6 +8079,9 @@
       </w:r>
     </w:p>
     <w:p>
+      <w:pPr>
+        <w:spacing w:before="40" w:after="20" w:line="240" w:lineRule="auto"/>
+      </w:pPr>
       <w:r>
         <w:rPr>
           <w:b/>
@@ -8107,7 +8122,7 @@
     </w:p>
     <w:p>
       <w:pPr>
-        <w:spacing w:before="80" w:after="40"/>
+        <w:spacing w:before="40" w:after="20" w:line="240" w:lineRule="auto"/>
       </w:pPr>
       <w:r>
         <w:rPr>
@@ -8280,6 +8295,9 @@
       </w:r>
     </w:p>
     <w:p>
+      <w:pPr>
+        <w:spacing w:before="40" w:after="20" w:line="240" w:lineRule="auto"/>
+      </w:pPr>
       <w:r>
         <w:rPr>
           <w:b/>

</xml_diff>

<commit_message>
fix(report): set red annotation paragraphs to exact 10pt line height
</commit_message>
<xml_diff>
--- a/docs/大数据可视化/《大数据可视化》课程设计报告.docx
+++ b/docs/大数据可视化/《大数据可视化》课程设计报告.docx
@@ -2944,7 +2944,7 @@
     </w:p>
     <w:p>
       <w:pPr>
-        <w:spacing w:before="40" w:after="20" w:line="240" w:lineRule="auto"/>
+        <w:spacing w:before="40" w:after="20" w:line="200" w:lineRule="exact"/>
       </w:pPr>
       <w:r>
         <w:rPr>
@@ -3094,7 +3094,7 @@
     </w:p>
     <w:p>
       <w:pPr>
-        <w:spacing w:before="40" w:after="20" w:line="240" w:lineRule="auto"/>
+        <w:spacing w:before="40" w:after="20" w:line="200" w:lineRule="exact"/>
       </w:pPr>
       <w:r>
         <w:rPr>
@@ -5164,7 +5164,7 @@
     </w:p>
     <w:p>
       <w:pPr>
-        <w:spacing w:before="40" w:after="20" w:line="240" w:lineRule="auto"/>
+        <w:spacing w:before="40" w:after="20" w:line="200" w:lineRule="exact"/>
       </w:pPr>
       <w:r>
         <w:rPr>
@@ -5206,7 +5206,7 @@
     </w:p>
     <w:p>
       <w:pPr>
-        <w:spacing w:before="40" w:after="20" w:line="240" w:lineRule="auto"/>
+        <w:spacing w:before="40" w:after="20" w:line="200" w:lineRule="exact"/>
       </w:pPr>
       <w:proofErr w:type="spellStart"/>
       <w:r>
@@ -6489,7 +6489,7 @@
     </w:p>
     <w:p>
       <w:pPr>
-        <w:spacing w:before="40" w:after="20" w:line="240" w:lineRule="auto"/>
+        <w:spacing w:before="40" w:after="20" w:line="200" w:lineRule="exact"/>
       </w:pPr>
       <w:r>
         <w:rPr>
@@ -6531,7 +6531,7 @@
     </w:p>
     <w:p>
       <w:pPr>
-        <w:spacing w:before="40" w:after="20" w:line="240" w:lineRule="auto"/>
+        <w:spacing w:before="40" w:after="20" w:line="200" w:lineRule="exact"/>
       </w:pPr>
       <w:proofErr w:type="spellStart"/>
       <w:r>
@@ -6948,7 +6948,7 @@
     </w:p>
     <w:p>
       <w:pPr>
-        <w:spacing w:before="40" w:after="20" w:line="240" w:lineRule="auto"/>
+        <w:spacing w:before="40" w:after="20" w:line="200" w:lineRule="exact"/>
       </w:pPr>
       <w:r>
         <w:rPr>
@@ -6990,7 +6990,7 @@
     </w:p>
     <w:p>
       <w:pPr>
-        <w:spacing w:before="40" w:after="20" w:line="240" w:lineRule="auto"/>
+        <w:spacing w:before="40" w:after="20" w:line="200" w:lineRule="exact"/>
       </w:pPr>
       <w:r>
         <w:rPr>
@@ -8080,7 +8080,7 @@
     </w:p>
     <w:p>
       <w:pPr>
-        <w:spacing w:before="40" w:after="20" w:line="240" w:lineRule="auto"/>
+        <w:spacing w:before="40" w:after="20" w:line="200" w:lineRule="exact"/>
       </w:pPr>
       <w:r>
         <w:rPr>
@@ -8122,7 +8122,7 @@
     </w:p>
     <w:p>
       <w:pPr>
-        <w:spacing w:before="40" w:after="20" w:line="240" w:lineRule="auto"/>
+        <w:spacing w:before="40" w:after="20" w:line="200" w:lineRule="exact"/>
       </w:pPr>
       <w:r>
         <w:rPr>
@@ -8296,7 +8296,7 @@
     </w:p>
     <w:p>
       <w:pPr>
-        <w:spacing w:before="40" w:after="20" w:line="240" w:lineRule="auto"/>
+        <w:spacing w:before="40" w:after="20" w:line="200" w:lineRule="exact"/>
       </w:pPr>
       <w:r>
         <w:rPr>

</xml_diff>